<commit_message>
Work Knowledge - 10/15/2025 part 2
</commit_message>
<xml_diff>
--- a/Knowledge/3-Work knowledge/1-Software Engineering/1-Testing/4-Multi Sources/Nezam - Test Case & Bug Report Writing/Source.docx
+++ b/Knowledge/3-Work knowledge/1-Software Engineering/1-Testing/4-Multi Sources/Nezam - Test Case & Bug Report Writing/Source.docx
@@ -9,6 +9,10 @@
           <w:ilvl w:val="0"/>
           <w:numId w:val="1"/>
         </w:numPr>
+        <w:rPr>
+          <w:b/>
+          <w:bCs/>
+        </w:rPr>
       </w:pPr>
       <w:r>
         <w:rPr>
@@ -117,20 +121,14 @@
           <w:b/>
           <w:bCs/>
         </w:rPr>
-        <w:t>Download Server / Mirror:</w:t>
-      </w:r>
-      <w:r>
-        <w:t xml:space="preserve"> YouTube CDN (googlevideo.com)</w:t>
-      </w:r>
-    </w:p>
-    <w:p>
-      <w:pPr>
-        <w:pStyle w:val="ListParagraph"/>
-        <w:rPr>
-          <w:b/>
-          <w:bCs/>
-        </w:rPr>
-      </w:pPr>
+        <w:t>Download Server / Mirror</w:t>
+      </w:r>
+      <w:r>
+        <w:t>: youtube.com</w:t>
+      </w:r>
+      <w:r>
+        <w:br/>
+      </w:r>
       <w:r>
         <w:t xml:space="preserve">* </w:t>
       </w:r>
@@ -370,10 +368,10 @@
           <w:b/>
           <w:bCs/>
         </w:rPr>
-        <w:t>Download Server / Mirror:</w:t>
-      </w:r>
-      <w:r>
-        <w:t xml:space="preserve"> YouTube CDN (googlevideo.com)</w:t>
+        <w:t>Download Server / Mirror</w:t>
+      </w:r>
+      <w:r>
+        <w:t>: youtube.com</w:t>
       </w:r>
     </w:p>
     <w:p>
@@ -514,6 +512,10 @@
           <w:ilvl w:val="0"/>
           <w:numId w:val="1"/>
         </w:numPr>
+        <w:rPr>
+          <w:b/>
+          <w:bCs/>
+        </w:rPr>
       </w:pPr>
       <w:r>
         <w:rPr>
@@ -610,11 +612,6 @@
             <w:rStyle w:val="Hyperlink"/>
           </w:rPr>
           <w:br/>
-        </w:r>
-        <w:r>
-          <w:rPr>
-            <w:rStyle w:val="Hyperlink"/>
-          </w:rPr>
           <w:t>https://www.youtube.com/watch?v=abd7A1MZGAg&amp;list=PLbJF4g421wqnW8dmPrLqzgVYsT95euPSL&amp;index=3</w:t>
         </w:r>
         <w:r>
@@ -632,20 +629,17 @@
           <w:b/>
           <w:bCs/>
         </w:rPr>
-        <w:t>Download Server / Mirror:</w:t>
-      </w:r>
-      <w:r>
-        <w:t xml:space="preserve"> YouTube CDN (googlevideo.com)</w:t>
-      </w:r>
-    </w:p>
-    <w:p>
-      <w:pPr>
-        <w:pStyle w:val="ListParagraph"/>
-        <w:rPr>
-          <w:b/>
-          <w:bCs/>
-        </w:rPr>
-      </w:pPr>
+        <w:t>Download Server / Mirror</w:t>
+      </w:r>
+      <w:r>
+        <w:t>: youtube.com</w:t>
+      </w:r>
+      <w:r>
+        <w:t xml:space="preserve"> </w:t>
+      </w:r>
+      <w:r>
+        <w:br/>
+      </w:r>
       <w:r>
         <w:t xml:space="preserve">* </w:t>
       </w:r>
@@ -1498,6 +1492,7 @@
   <w:style w:type="character" w:default="1" w:styleId="DefaultParagraphFont">
     <w:name w:val="Default Paragraph Font"/>
     <w:uiPriority w:val="1"/>
+    <w:semiHidden/>
     <w:unhideWhenUsed/>
   </w:style>
   <w:style w:type="table" w:default="1" w:styleId="TableNormal">

</xml_diff>